<commit_message>
Endret oppgave 1.2 ved å legge til 3 deloppgaver
</commit_message>
<xml_diff>
--- a/arbeidshefter_r1_word/2_funksjonsdrofting.docx
+++ b/arbeidshefter_r1_word/2_funksjonsdrofting.docx
@@ -3150,6 +3150,244 @@
             </m:r>
           </m:sup>
         </m:sSup>
+      </m:oMath>
+    </w:p>
+    <w:p>
+      <w:pPr>
+        <w:pStyle w:val="Listeavsnitt"/>
+        <w:numPr>
+          <w:ilvl w:val="0"/>
+          <w:numId w:val="21"/>
+        </w:numPr>
+        <w:spacing w:line="360" w:lineRule="auto"/>
+      </w:pPr>
+      <m:oMath>
+        <m:r>
+          <w:rPr>
+            <w:rFonts w:ascii="Cambria Math" w:hAnsi="Cambria Math"/>
+          </w:rPr>
+          <m:t>f</m:t>
+        </m:r>
+        <m:d>
+          <m:dPr>
+            <m:ctrlPr>
+              <w:rPr>
+                <w:rFonts w:ascii="Cambria Math" w:hAnsi="Cambria Math"/>
+                <w:i/>
+              </w:rPr>
+            </m:ctrlPr>
+          </m:dPr>
+          <m:e>
+            <m:r>
+              <w:rPr>
+                <w:rFonts w:ascii="Cambria Math" w:hAnsi="Cambria Math"/>
+              </w:rPr>
+              <m:t>x</m:t>
+            </m:r>
+          </m:e>
+        </m:d>
+        <m:r>
+          <w:rPr>
+            <w:rFonts w:ascii="Cambria Math" w:hAnsi="Cambria Math"/>
+          </w:rPr>
+          <m:t>=3⋅</m:t>
+        </m:r>
+        <m:rad>
+          <m:radPr>
+            <m:degHide m:val="1"/>
+            <m:ctrlPr>
+              <w:rPr>
+                <w:rFonts w:ascii="Cambria Math" w:hAnsi="Cambria Math"/>
+                <w:i/>
+              </w:rPr>
+            </m:ctrlPr>
+          </m:radPr>
+          <m:deg/>
+          <m:e>
+            <m:r>
+              <w:rPr>
+                <w:rFonts w:ascii="Cambria Math" w:hAnsi="Cambria Math"/>
+              </w:rPr>
+              <m:t>x</m:t>
+            </m:r>
+          </m:e>
+        </m:rad>
+      </m:oMath>
+    </w:p>
+    <w:p>
+      <w:pPr>
+        <w:pStyle w:val="Listeavsnitt"/>
+        <w:numPr>
+          <w:ilvl w:val="0"/>
+          <w:numId w:val="21"/>
+        </w:numPr>
+        <w:spacing w:line="360" w:lineRule="auto"/>
+      </w:pPr>
+      <m:oMath>
+        <m:r>
+          <w:rPr>
+            <w:rFonts w:ascii="Cambria Math" w:eastAsiaTheme="minorEastAsia" w:hAnsi="Cambria Math"/>
+          </w:rPr>
+          <m:t>f</m:t>
+        </m:r>
+        <m:d>
+          <m:dPr>
+            <m:ctrlPr>
+              <w:rPr>
+                <w:rFonts w:ascii="Cambria Math" w:eastAsiaTheme="minorEastAsia" w:hAnsi="Cambria Math"/>
+                <w:i/>
+              </w:rPr>
+            </m:ctrlPr>
+          </m:dPr>
+          <m:e>
+            <m:r>
+              <w:rPr>
+                <w:rFonts w:ascii="Cambria Math" w:eastAsiaTheme="minorEastAsia" w:hAnsi="Cambria Math"/>
+              </w:rPr>
+              <m:t>x</m:t>
+            </m:r>
+          </m:e>
+        </m:d>
+        <m:r>
+          <w:rPr>
+            <w:rFonts w:ascii="Cambria Math" w:eastAsiaTheme="minorEastAsia" w:hAnsi="Cambria Math"/>
+          </w:rPr>
+          <m:t>=</m:t>
+        </m:r>
+        <m:rad>
+          <m:radPr>
+            <m:ctrlPr>
+              <w:rPr>
+                <w:rFonts w:ascii="Cambria Math" w:eastAsiaTheme="minorEastAsia" w:hAnsi="Cambria Math"/>
+                <w:i/>
+              </w:rPr>
+            </m:ctrlPr>
+          </m:radPr>
+          <m:deg>
+            <m:r>
+              <w:rPr>
+                <w:rFonts w:ascii="Cambria Math" w:eastAsiaTheme="minorEastAsia" w:hAnsi="Cambria Math"/>
+              </w:rPr>
+              <m:t>3</m:t>
+            </m:r>
+          </m:deg>
+          <m:e>
+            <m:sSup>
+              <m:sSupPr>
+                <m:ctrlPr>
+                  <w:rPr>
+                    <w:rFonts w:ascii="Cambria Math" w:eastAsiaTheme="minorEastAsia" w:hAnsi="Cambria Math"/>
+                    <w:i/>
+                  </w:rPr>
+                </m:ctrlPr>
+              </m:sSupPr>
+              <m:e>
+                <m:r>
+                  <w:rPr>
+                    <w:rFonts w:ascii="Cambria Math" w:eastAsiaTheme="minorEastAsia" w:hAnsi="Cambria Math"/>
+                  </w:rPr>
+                  <m:t>x</m:t>
+                </m:r>
+              </m:e>
+              <m:sup>
+                <m:r>
+                  <w:rPr>
+                    <w:rFonts w:ascii="Cambria Math" w:eastAsiaTheme="minorEastAsia" w:hAnsi="Cambria Math"/>
+                  </w:rPr>
+                  <m:t>5</m:t>
+                </m:r>
+              </m:sup>
+            </m:sSup>
+          </m:e>
+        </m:rad>
+      </m:oMath>
+    </w:p>
+    <w:p>
+      <w:pPr>
+        <w:pStyle w:val="Listeavsnitt"/>
+        <w:numPr>
+          <w:ilvl w:val="0"/>
+          <w:numId w:val="21"/>
+        </w:numPr>
+        <w:spacing w:line="360" w:lineRule="auto"/>
+      </w:pPr>
+      <m:oMath>
+        <m:r>
+          <w:rPr>
+            <w:rFonts w:ascii="Cambria Math" w:eastAsiaTheme="minorEastAsia" w:hAnsi="Cambria Math"/>
+          </w:rPr>
+          <m:t>f</m:t>
+        </m:r>
+        <m:d>
+          <m:dPr>
+            <m:ctrlPr>
+              <w:rPr>
+                <w:rFonts w:ascii="Cambria Math" w:eastAsiaTheme="minorEastAsia" w:hAnsi="Cambria Math"/>
+                <w:i/>
+              </w:rPr>
+            </m:ctrlPr>
+          </m:dPr>
+          <m:e>
+            <m:r>
+              <w:rPr>
+                <w:rFonts w:ascii="Cambria Math" w:eastAsiaTheme="minorEastAsia" w:hAnsi="Cambria Math"/>
+              </w:rPr>
+              <m:t>x</m:t>
+            </m:r>
+          </m:e>
+        </m:d>
+        <m:r>
+          <w:rPr>
+            <w:rFonts w:ascii="Cambria Math" w:hAnsi="Cambria Math"/>
+          </w:rPr>
+          <m:t>=</m:t>
+        </m:r>
+        <m:f>
+          <m:fPr>
+            <m:ctrlPr>
+              <w:rPr>
+                <w:rFonts w:ascii="Cambria Math" w:hAnsi="Cambria Math"/>
+                <w:i/>
+              </w:rPr>
+            </m:ctrlPr>
+          </m:fPr>
+          <m:num>
+            <m:r>
+              <w:rPr>
+                <w:rFonts w:ascii="Cambria Math" w:hAnsi="Cambria Math"/>
+              </w:rPr>
+              <m:t>1</m:t>
+            </m:r>
+          </m:num>
+          <m:den>
+            <m:sSup>
+              <m:sSupPr>
+                <m:ctrlPr>
+                  <w:rPr>
+                    <w:rFonts w:ascii="Cambria Math" w:hAnsi="Cambria Math"/>
+                    <w:i/>
+                  </w:rPr>
+                </m:ctrlPr>
+              </m:sSupPr>
+              <m:e>
+                <m:r>
+                  <w:rPr>
+                    <w:rFonts w:ascii="Cambria Math" w:hAnsi="Cambria Math"/>
+                  </w:rPr>
+                  <m:t>x</m:t>
+                </m:r>
+              </m:e>
+              <m:sup>
+                <m:r>
+                  <w:rPr>
+                    <w:rFonts w:ascii="Cambria Math" w:hAnsi="Cambria Math"/>
+                  </w:rPr>
+                  <m:t>3</m:t>
+                </m:r>
+              </m:sup>
+            </m:sSup>
+          </m:den>
+        </m:f>
         <m:r>
           <m:rPr>
             <m:sty m:val="p"/>
@@ -3592,7 +3830,21 @@
         <w:rPr>
           <w:lang w:val="en-US"/>
         </w:rPr>
-        <w:t>Finn f′(x).</w:t>
+        <w:t>Finn </w:t>
+      </w:r>
+      <w:proofErr w:type="gramStart"/>
+      <w:r>
+        <w:rPr>
+          <w:lang w:val="en-US"/>
+        </w:rPr>
+        <w:t>f′(</w:t>
+      </w:r>
+      <w:proofErr w:type="gramEnd"/>
+      <w:r>
+        <w:rPr>
+          <w:lang w:val="en-US"/>
+        </w:rPr>
+        <w:t>x).</w:t>
       </w:r>
     </w:p>
     <w:p>
@@ -3628,7 +3880,15 @@
         <w:spacing w:line="240" w:lineRule="auto"/>
       </w:pPr>
       <w:r>
-        <w:t>Finn likningen for tangenten i (3,f(3)).</w:t>
+        <w:t>Finn likningen for tangenten i (</w:t>
+      </w:r>
+      <w:proofErr w:type="gramStart"/>
+      <w:r>
+        <w:t>3,f</w:t>
+      </w:r>
+      <w:proofErr w:type="gramEnd"/>
+      <w:r>
+        <w:t>(3)).</w:t>
       </w:r>
     </w:p>
     <w:p>
@@ -3745,7 +4005,21 @@
         <w:rPr>
           <w:lang w:val="en-US"/>
         </w:rPr>
-        <w:t>Finn f′(x).</w:t>
+        <w:t>Finn </w:t>
+      </w:r>
+      <w:proofErr w:type="gramStart"/>
+      <w:r>
+        <w:rPr>
+          <w:lang w:val="en-US"/>
+        </w:rPr>
+        <w:t>f′(</w:t>
+      </w:r>
+      <w:proofErr w:type="gramEnd"/>
+      <w:r>
+        <w:rPr>
+          <w:lang w:val="en-US"/>
+        </w:rPr>
+        <w:t>x).</w:t>
       </w:r>
     </w:p>
     <w:p>
@@ -3775,7 +4049,15 @@
         <w:spacing w:line="240" w:lineRule="auto"/>
       </w:pPr>
       <w:r>
-        <w:t>Finn likningen for tangenten i punktet (1,f(1)).</w:t>
+        <w:t>Finn likningen for tangenten i punktet (</w:t>
+      </w:r>
+      <w:proofErr w:type="gramStart"/>
+      <w:r>
+        <w:t>1,f</w:t>
+      </w:r>
+      <w:proofErr w:type="gramEnd"/>
+      <w:r>
+        <w:t>(1)).</w:t>
       </w:r>
     </w:p>
     <w:p>
@@ -7097,14 +7379,7 @@
             <w:rFonts w:ascii="Cambria Math" w:hAnsi="Cambria Math"/>
             <w:lang w:val="en-US"/>
           </w:rPr>
-          <m:t>x</m:t>
-        </m:r>
-        <m:r>
-          <w:rPr>
-            <w:rFonts w:ascii="Cambria Math" w:hAnsi="Cambria Math"/>
-            <w:lang w:val="en-US"/>
-          </w:rPr>
-          <m:t> </m:t>
+          <m:t>x </m:t>
         </m:r>
       </m:oMath>
     </w:p>
@@ -7127,6 +7402,336 @@
           </w:rPr>
           <m:t>f'(x)=2x - 2 </m:t>
         </m:r>
+      </m:oMath>
+    </w:p>
+    <w:p>
+      <w:pPr>
+        <w:pStyle w:val="Listeavsnitt"/>
+        <w:numPr>
+          <w:ilvl w:val="0"/>
+          <w:numId w:val="13"/>
+        </w:numPr>
+        <w:spacing w:line="360" w:lineRule="auto"/>
+      </w:pPr>
+      <m:oMath>
+        <m:r>
+          <w:rPr>
+            <w:rFonts w:ascii="Cambria Math" w:hAnsi="Cambria Math"/>
+          </w:rPr>
+          <m:t>f</m:t>
+        </m:r>
+        <m:r>
+          <w:rPr>
+            <w:rFonts w:ascii="Cambria Math" w:hAnsi="Cambria Math"/>
+          </w:rPr>
+          <m:t>'</m:t>
+        </m:r>
+        <m:d>
+          <m:dPr>
+            <m:ctrlPr>
+              <w:rPr>
+                <w:rFonts w:ascii="Cambria Math" w:hAnsi="Cambria Math"/>
+                <w:i/>
+              </w:rPr>
+            </m:ctrlPr>
+          </m:dPr>
+          <m:e>
+            <m:r>
+              <w:rPr>
+                <w:rFonts w:ascii="Cambria Math" w:hAnsi="Cambria Math"/>
+              </w:rPr>
+              <m:t>x</m:t>
+            </m:r>
+          </m:e>
+        </m:d>
+        <m:r>
+          <w:rPr>
+            <w:rFonts w:ascii="Cambria Math" w:hAnsi="Cambria Math"/>
+          </w:rPr>
+          <m:t>=</m:t>
+        </m:r>
+        <m:f>
+          <m:fPr>
+            <m:ctrlPr>
+              <w:rPr>
+                <w:rFonts w:ascii="Cambria Math" w:hAnsi="Cambria Math"/>
+                <w:i/>
+              </w:rPr>
+            </m:ctrlPr>
+          </m:fPr>
+          <m:num>
+            <m:r>
+              <w:rPr>
+                <w:rFonts w:ascii="Cambria Math" w:hAnsi="Cambria Math"/>
+              </w:rPr>
+              <m:t>3</m:t>
+            </m:r>
+          </m:num>
+          <m:den>
+            <m:r>
+              <w:rPr>
+                <w:rFonts w:ascii="Cambria Math" w:hAnsi="Cambria Math"/>
+              </w:rPr>
+              <m:t>2</m:t>
+            </m:r>
+            <m:rad>
+              <m:radPr>
+                <m:degHide m:val="1"/>
+                <m:ctrlPr>
+                  <w:rPr>
+                    <w:rFonts w:ascii="Cambria Math" w:hAnsi="Cambria Math"/>
+                    <w:i/>
+                  </w:rPr>
+                </m:ctrlPr>
+              </m:radPr>
+              <m:deg/>
+              <m:e>
+                <m:r>
+                  <w:rPr>
+                    <w:rFonts w:ascii="Cambria Math" w:hAnsi="Cambria Math"/>
+                  </w:rPr>
+                  <m:t>x</m:t>
+                </m:r>
+              </m:e>
+            </m:rad>
+          </m:den>
+        </m:f>
+      </m:oMath>
+    </w:p>
+    <w:p>
+      <w:pPr>
+        <w:pStyle w:val="Listeavsnitt"/>
+        <w:numPr>
+          <w:ilvl w:val="0"/>
+          <w:numId w:val="13"/>
+        </w:numPr>
+        <w:spacing w:line="360" w:lineRule="auto"/>
+      </w:pPr>
+      <m:oMath>
+        <m:sSup>
+          <m:sSupPr>
+            <m:ctrlPr>
+              <w:rPr>
+                <w:rFonts w:ascii="Cambria Math" w:eastAsiaTheme="minorEastAsia" w:hAnsi="Cambria Math"/>
+                <w:i/>
+              </w:rPr>
+            </m:ctrlPr>
+          </m:sSupPr>
+          <m:e>
+            <m:r>
+              <w:rPr>
+                <w:rFonts w:ascii="Cambria Math" w:eastAsiaTheme="minorEastAsia" w:hAnsi="Cambria Math"/>
+              </w:rPr>
+              <m:t>f</m:t>
+            </m:r>
+          </m:e>
+          <m:sup>
+            <m:r>
+              <w:rPr>
+                <w:rFonts w:ascii="Cambria Math" w:eastAsiaTheme="minorEastAsia" w:hAnsi="Cambria Math"/>
+              </w:rPr>
+              <m:t>'</m:t>
+            </m:r>
+            <m:d>
+              <m:dPr>
+                <m:ctrlPr>
+                  <w:rPr>
+                    <w:rFonts w:ascii="Cambria Math" w:eastAsiaTheme="minorEastAsia" w:hAnsi="Cambria Math"/>
+                    <w:i/>
+                  </w:rPr>
+                </m:ctrlPr>
+              </m:dPr>
+              <m:e>
+                <m:r>
+                  <w:rPr>
+                    <w:rFonts w:ascii="Cambria Math" w:eastAsiaTheme="minorEastAsia" w:hAnsi="Cambria Math"/>
+                  </w:rPr>
+                  <m:t>x</m:t>
+                </m:r>
+              </m:e>
+            </m:d>
+          </m:sup>
+        </m:sSup>
+        <m:r>
+          <w:rPr>
+            <w:rFonts w:ascii="Cambria Math" w:eastAsiaTheme="minorEastAsia" w:hAnsi="Cambria Math"/>
+          </w:rPr>
+          <m:t>=</m:t>
+        </m:r>
+        <m:f>
+          <m:fPr>
+            <m:ctrlPr>
+              <w:rPr>
+                <w:rFonts w:ascii="Cambria Math" w:eastAsiaTheme="minorEastAsia" w:hAnsi="Cambria Math"/>
+                <w:i/>
+              </w:rPr>
+            </m:ctrlPr>
+          </m:fPr>
+          <m:num>
+            <m:r>
+              <w:rPr>
+                <w:rFonts w:ascii="Cambria Math" w:eastAsiaTheme="minorEastAsia" w:hAnsi="Cambria Math"/>
+              </w:rPr>
+              <m:t>5</m:t>
+            </m:r>
+            <m:rad>
+              <m:radPr>
+                <m:ctrlPr>
+                  <w:rPr>
+                    <w:rFonts w:ascii="Cambria Math" w:eastAsiaTheme="minorEastAsia" w:hAnsi="Cambria Math"/>
+                    <w:i/>
+                  </w:rPr>
+                </m:ctrlPr>
+              </m:radPr>
+              <m:deg>
+                <m:r>
+                  <w:rPr>
+                    <w:rFonts w:ascii="Cambria Math" w:eastAsiaTheme="minorEastAsia" w:hAnsi="Cambria Math"/>
+                  </w:rPr>
+                  <m:t>3</m:t>
+                </m:r>
+              </m:deg>
+              <m:e>
+                <m:sSup>
+                  <m:sSupPr>
+                    <m:ctrlPr>
+                      <w:rPr>
+                        <w:rFonts w:ascii="Cambria Math" w:eastAsiaTheme="minorEastAsia" w:hAnsi="Cambria Math"/>
+                        <w:i/>
+                      </w:rPr>
+                    </m:ctrlPr>
+                  </m:sSupPr>
+                  <m:e>
+                    <m:r>
+                      <w:rPr>
+                        <w:rFonts w:ascii="Cambria Math" w:eastAsiaTheme="minorEastAsia" w:hAnsi="Cambria Math"/>
+                      </w:rPr>
+                      <m:t>x</m:t>
+                    </m:r>
+                  </m:e>
+                  <m:sup>
+                    <m:r>
+                      <w:rPr>
+                        <w:rFonts w:ascii="Cambria Math" w:eastAsiaTheme="minorEastAsia" w:hAnsi="Cambria Math"/>
+                      </w:rPr>
+                      <m:t>2</m:t>
+                    </m:r>
+                  </m:sup>
+                </m:sSup>
+              </m:e>
+            </m:rad>
+          </m:num>
+          <m:den>
+            <m:r>
+              <w:rPr>
+                <w:rFonts w:ascii="Cambria Math" w:eastAsiaTheme="minorEastAsia" w:hAnsi="Cambria Math"/>
+              </w:rPr>
+              <m:t>3</m:t>
+            </m:r>
+          </m:den>
+        </m:f>
+      </m:oMath>
+    </w:p>
+    <w:p>
+      <w:pPr>
+        <w:pStyle w:val="Listeavsnitt"/>
+        <w:numPr>
+          <w:ilvl w:val="0"/>
+          <w:numId w:val="13"/>
+        </w:numPr>
+        <w:rPr>
+          <w:lang w:val="en-US"/>
+        </w:rPr>
+      </w:pPr>
+      <m:oMath>
+        <m:r>
+          <w:rPr>
+            <w:rFonts w:ascii="Cambria Math" w:eastAsiaTheme="minorEastAsia" w:hAnsi="Cambria Math"/>
+          </w:rPr>
+          <m:t>f</m:t>
+        </m:r>
+        <m:r>
+          <w:rPr>
+            <w:rFonts w:ascii="Cambria Math" w:eastAsiaTheme="minorEastAsia" w:hAnsi="Cambria Math"/>
+          </w:rPr>
+          <m:t>'</m:t>
+        </m:r>
+        <m:d>
+          <m:dPr>
+            <m:ctrlPr>
+              <w:rPr>
+                <w:rFonts w:ascii="Cambria Math" w:eastAsiaTheme="minorEastAsia" w:hAnsi="Cambria Math"/>
+                <w:i/>
+              </w:rPr>
+            </m:ctrlPr>
+          </m:dPr>
+          <m:e>
+            <m:r>
+              <w:rPr>
+                <w:rFonts w:ascii="Cambria Math" w:eastAsiaTheme="minorEastAsia" w:hAnsi="Cambria Math"/>
+              </w:rPr>
+              <m:t>x</m:t>
+            </m:r>
+          </m:e>
+        </m:d>
+        <m:r>
+          <w:rPr>
+            <w:rFonts w:ascii="Cambria Math" w:hAnsi="Cambria Math"/>
+          </w:rPr>
+          <m:t>=</m:t>
+        </m:r>
+        <m:r>
+          <w:rPr>
+            <w:rFonts w:ascii="Cambria Math" w:hAnsi="Cambria Math"/>
+          </w:rPr>
+          <m:t>-</m:t>
+        </m:r>
+        <m:f>
+          <m:fPr>
+            <m:ctrlPr>
+              <w:rPr>
+                <w:rFonts w:ascii="Cambria Math" w:hAnsi="Cambria Math"/>
+                <w:i/>
+              </w:rPr>
+            </m:ctrlPr>
+          </m:fPr>
+          <m:num>
+            <m:r>
+              <w:rPr>
+                <w:rFonts w:ascii="Cambria Math" w:hAnsi="Cambria Math"/>
+              </w:rPr>
+              <m:t>3</m:t>
+            </m:r>
+          </m:num>
+          <m:den>
+            <m:sSup>
+              <m:sSupPr>
+                <m:ctrlPr>
+                  <w:rPr>
+                    <w:rFonts w:ascii="Cambria Math" w:hAnsi="Cambria Math"/>
+                    <w:i/>
+                  </w:rPr>
+                </m:ctrlPr>
+              </m:sSupPr>
+              <m:e>
+                <m:r>
+                  <w:rPr>
+                    <w:rFonts w:ascii="Cambria Math" w:hAnsi="Cambria Math"/>
+                  </w:rPr>
+                  <m:t>x</m:t>
+                </m:r>
+              </m:e>
+              <m:sup>
+                <m:r>
+                  <w:rPr>
+                    <w:rFonts w:ascii="Cambria Math" w:hAnsi="Cambria Math"/>
+                  </w:rPr>
+                  <m:t>4</m:t>
+                </m:r>
+              </m:sup>
+            </m:sSup>
+          </m:den>
+        </m:f>
       </m:oMath>
     </w:p>
     <w:p>
@@ -8131,7 +8736,6 @@
         <w:docPartUnique/>
       </w:docPartObj>
     </w:sdtPr>
-    <w:sdtEndPr/>
     <w:sdtContent>
       <w:p>
         <w:pPr>
@@ -11568,20 +12172,20 @@
 </file>
 
 <file path=customXml/item1.xml><?xml version="1.0" encoding="utf-8"?>
-<p:properties xmlns:p="http://schemas.microsoft.com/office/2006/metadata/properties" xmlns:xsi="http://www.w3.org/2001/XMLSchema-instance" xmlns:pc="http://schemas.microsoft.com/office/infopath/2007/PartnerControls">
-  <documentManagement>
-    <Kortbeskrivelse xmlns="17820eb2-e900-4c69-9281-707a51dd939a" xsi:nil="true"/>
-  </documentManagement>
-</p:properties>
-</file>
-
-<file path=customXml/item2.xml><?xml version="1.0" encoding="utf-8"?>
 <?mso-contentType ?>
 <FormTemplates xmlns="http://schemas.microsoft.com/sharepoint/v3/contenttype/forms">
   <Display>DocumentLibraryForm</Display>
   <Edit>DocumentLibraryForm</Edit>
   <New>DocumentLibraryForm</New>
 </FormTemplates>
+</file>
+
+<file path=customXml/item2.xml><?xml version="1.0" encoding="utf-8"?>
+<p:properties xmlns:p="http://schemas.microsoft.com/office/2006/metadata/properties" xmlns:xsi="http://www.w3.org/2001/XMLSchema-instance" xmlns:pc="http://schemas.microsoft.com/office/infopath/2007/PartnerControls">
+  <documentManagement>
+    <Kortbeskrivelse xmlns="17820eb2-e900-4c69-9281-707a51dd939a" xsi:nil="true"/>
+  </documentManagement>
+</p:properties>
 </file>
 
 <file path=customXml/item3.xml><?xml version="1.0" encoding="utf-8"?>
@@ -11737,19 +12341,19 @@
 </file>
 
 <file path=customXml/itemProps1.xml><?xml version="1.0" encoding="utf-8"?>
+<ds:datastoreItem xmlns:ds="http://schemas.openxmlformats.org/officeDocument/2006/customXml" ds:itemID="{54EE6BBC-22E7-4FF5-95C6-B2CFF8384212}">
+  <ds:schemaRefs>
+    <ds:schemaRef ds:uri="http://schemas.microsoft.com/sharepoint/v3/contenttype/forms"/>
+  </ds:schemaRefs>
+</ds:datastoreItem>
+</file>
+
+<file path=customXml/itemProps2.xml><?xml version="1.0" encoding="utf-8"?>
 <ds:datastoreItem xmlns:ds="http://schemas.openxmlformats.org/officeDocument/2006/customXml" ds:itemID="{A9E70B14-6E2F-4E57-9502-EF7416CBC490}">
   <ds:schemaRefs>
     <ds:schemaRef ds:uri="http://schemas.microsoft.com/office/2006/metadata/properties"/>
     <ds:schemaRef ds:uri="http://schemas.microsoft.com/office/infopath/2007/PartnerControls"/>
     <ds:schemaRef ds:uri="17820eb2-e900-4c69-9281-707a51dd939a"/>
-  </ds:schemaRefs>
-</ds:datastoreItem>
-</file>
-
-<file path=customXml/itemProps2.xml><?xml version="1.0" encoding="utf-8"?>
-<ds:datastoreItem xmlns:ds="http://schemas.openxmlformats.org/officeDocument/2006/customXml" ds:itemID="{54EE6BBC-22E7-4FF5-95C6-B2CFF8384212}">
-  <ds:schemaRefs>
-    <ds:schemaRef ds:uri="http://schemas.microsoft.com/sharepoint/v3/contenttype/forms"/>
   </ds:schemaRefs>
 </ds:datastoreItem>
 </file>

</xml_diff>